<commit_message>
membuat atau memperbaiki bug restarting number/point
</commit_message>
<xml_diff>
--- a/formating-docx/My Document.docx
+++ b/formating-docx/My Document.docx
@@ -4,74 +4,128 @@
   <w:body>
     <w:p>
       <w:pPr>
-        <w:pStyle w:val="ListParagraph"/>
-        <w:numPr>
-          <w:ilvl w:val="0"/>
-          <w:numId w:val="4"/>
-        </w:numPr>
-      </w:pPr>
-      <w:r>
-        <w:t xml:space="preserve">REF1 - inst:0 - lvl:0</w:t>
-      </w:r>
-    </w:p>
-    <w:p>
-      <w:pPr>
-        <w:pStyle w:val="ListParagraph"/>
-        <w:numPr>
-          <w:ilvl w:val="0"/>
-          <w:numId w:val="4"/>
-        </w:numPr>
-      </w:pPr>
-      <w:r>
-        <w:t xml:space="preserve">REF1 - inst:0 - lvl:0</w:t>
-      </w:r>
-    </w:p>
-    <w:p>
-      <w:pPr>
-        <w:pStyle w:val="ListParagraph"/>
-        <w:numPr>
-          <w:ilvl w:val="0"/>
-          <w:numId w:val="5"/>
-        </w:numPr>
-      </w:pPr>
-      <w:r>
-        <w:t xml:space="preserve">REF1 - inst:0 - lvl:0</w:t>
-      </w:r>
-    </w:p>
-    <w:p>
-      <w:pPr>
-        <w:pStyle w:val="ListParagraph"/>
-        <w:numPr>
-          <w:ilvl w:val="0"/>
-          <w:numId w:val="5"/>
-        </w:numPr>
-      </w:pPr>
-      <w:r>
-        <w:t xml:space="preserve">REF1 - inst:0 - lvl:0</w:t>
-      </w:r>
-    </w:p>
-    <w:p>
-      <w:pPr>
-        <w:pStyle w:val="ListParagraph"/>
-        <w:numPr>
-          <w:ilvl w:val="0"/>
-          <w:numId w:val="6"/>
-        </w:numPr>
-      </w:pPr>
-      <w:r>
-        <w:t xml:space="preserve">REF1 - inst:0 - lvl:0</w:t>
-      </w:r>
-    </w:p>
-    <w:p>
-      <w:pPr>
-        <w:pStyle w:val="ListParagraph"/>
-        <w:numPr>
-          <w:ilvl w:val="0"/>
-          <w:numId w:val="6"/>
-        </w:numPr>
-      </w:pPr>
-      <w:r>
-        <w:t xml:space="preserve">REF1 - inst:0 - lvl:0</w:t>
+        <w:pStyle w:val="bold"/>
+        <w:numPr>
+          <w:ilvl w:val="0"/>
+          <w:numId w:val="7"/>
+        </w:numPr>
+        <w:spacing w:line="360"/>
+        <w:ind w:left="283" w:hanging="272" w:firstLine="0"/>
+        <w:jc w:val="both"/>
+      </w:pPr>
+      <w:r>
+        <w:rPr>
+          <w:color w:val="000000"/>
+          <w:sz w:val="24"/>
+          <w:szCs w:val="24"/>
+          <w:rFonts w:ascii="Times New Roman" w:cs="Times New Roman" w:eastAsia="Times New Roman" w:hAnsi="Times New Roman"/>
+        </w:rPr>
+        <w:t xml:space="preserve">Pengertian Jihad</w:t>
+      </w:r>
+    </w:p>
+    <w:p>
+      <w:pPr>
+        <w:pStyle w:val="normal"/>
+        <w:numPr>
+          <w:ilvl w:val="0"/>
+          <w:numId w:val="8"/>
+        </w:numPr>
+        <w:spacing w:line="360"/>
+        <w:ind w:left="566" w:hanging="277" w:firstLine="277"/>
+        <w:jc w:val="both"/>
+      </w:pPr>
+      <w:r>
+        <w:rPr>
+          <w:color w:val="000000"/>
+          <w:sz w:val="24"/>
+          <w:szCs w:val="24"/>
+          <w:rFonts w:ascii="Times New Roman" w:cs="Times New Roman" w:eastAsia="Times New Roman" w:hAnsi="Times New Roman"/>
+        </w:rPr>
+        <w:t xml:space="preserve">Mengangkat senjata, sebagaimana dalam QS. An-Nisa: 95:</w:t>
+      </w:r>
+    </w:p>
+    <w:p>
+      <w:pPr>
+        <w:pStyle w:val="normal"/>
+        <w:numPr>
+          <w:ilvl w:val="0"/>
+          <w:numId w:val="8"/>
+        </w:numPr>
+        <w:spacing w:line="360"/>
+        <w:ind w:left="566" w:hanging="277" w:firstLine="277"/>
+        <w:jc w:val="both"/>
+      </w:pPr>
+      <w:r>
+        <w:rPr>
+          <w:color w:val="000000"/>
+          <w:sz w:val="24"/>
+          <w:szCs w:val="24"/>
+          <w:rFonts w:ascii="Times New Roman" w:cs="Times New Roman" w:eastAsia="Times New Roman" w:hAnsi="Times New Roman"/>
+        </w:rPr>
+        <w:t xml:space="preserve">Ucapan, argumen, dan pendapat (qawl), sebagaimana dalam QS. Al-Furqan: 52:</w:t>
+      </w:r>
+    </w:p>
+    <w:p>
+      <w:pPr>
+        <w:pStyle w:val="bold"/>
+        <w:numPr>
+          <w:ilvl w:val="0"/>
+          <w:numId w:val="7"/>
+        </w:numPr>
+        <w:spacing w:line="360"/>
+        <w:ind w:left="283" w:hanging="272" w:firstLine="0"/>
+        <w:jc w:val="both"/>
+      </w:pPr>
+      <w:r>
+        <w:rPr>
+          <w:color w:val="000000"/>
+          <w:sz w:val="24"/>
+          <w:szCs w:val="24"/>
+          <w:rFonts w:ascii="Times New Roman" w:cs="Times New Roman" w:eastAsia="Times New Roman" w:hAnsi="Times New Roman"/>
+        </w:rPr>
+        <w:t xml:space="preserve">Perbedaan Jihad dan Terorisme</w:t>
+      </w:r>
+    </w:p>
+    <w:p>
+      <w:pPr>
+        <w:pStyle w:val="normal"/>
+        <w:numPr>
+          <w:ilvl w:val="0"/>
+          <w:numId w:val="9"/>
+        </w:numPr>
+        <w:spacing w:line="360"/>
+        <w:ind w:left="566" w:hanging="277" w:firstLine="277"/>
+        <w:jc w:val="both"/>
+      </w:pPr>
+      <w:r>
+        <w:rPr>
+          <w:color w:val="000000"/>
+          <w:sz w:val="24"/>
+          <w:szCs w:val="24"/>
+          <w:rFonts w:ascii="Times New Roman" w:cs="Times New Roman" w:eastAsia="Times New Roman" w:hAnsi="Times New Roman"/>
+        </w:rPr>
+        <w:t xml:space="preserve">Mengangkat senjata, sebagaimana dalam QS. An-Nisa: 95:</w:t>
+      </w:r>
+    </w:p>
+    <w:p>
+      <w:pPr>
+        <w:pStyle w:val="normal"/>
+        <w:numPr>
+          <w:ilvl w:val="0"/>
+          <w:numId w:val="9"/>
+        </w:numPr>
+        <w:spacing w:line="360"/>
+        <w:ind w:left="566" w:hanging="277" w:firstLine="277"/>
+        <w:jc w:val="both"/>
+      </w:pPr>
+      <w:r>
+        <w:rPr>
+          <w:color w:val="000000"/>
+          <w:sz w:val="24"/>
+          <w:szCs w:val="24"/>
+          <w:rFonts w:ascii="Times New Roman" w:cs="Times New Roman" w:eastAsia="Times New Roman" w:hAnsi="Times New Roman"/>
+        </w:rPr>
+        <w:t xml:space="preserve">Ucapan, argumen, dan pendapat (qawl), sebagaimana dalam QS. Al-Furqan: 52:</w:t>
       </w:r>
     </w:p>
     <w:sectPr>
@@ -215,18 +269,45 @@
     <w:multiLevelType w:val="hybridMultilevel"/>
     <w:lvl w:ilvl="0" w15:tentative="1">
       <w:start w:val="1"/>
+      <w:numFmt w:val="upperLetter"/>
+      <w:lvlText w:val="%1."/>
+      <w:lvlJc w:val="left"/>
+    </w:lvl>
+  </w:abstractNum>
+  <w:abstractNum w:abstractNumId="3" w15:restartNumberingAfterBreak="0">
+    <w:multiLevelType w:val="hybridMultilevel"/>
+    <w:lvl w:ilvl="0" w15:tentative="1">
+      <w:start w:val="1"/>
       <w:numFmt w:val="decimal"/>
-      <w:lvlText w:val="%1"/>
-      <w:lvlJc w:val="start"/>
-    </w:lvl>
-  </w:abstractNum>
-  <w:abstractNum w:abstractNumId="3" w15:restartNumberingAfterBreak="0">
-    <w:multiLevelType w:val="hybridMultilevel"/>
-    <w:lvl w:ilvl="2" w15:tentative="1">
+      <w:lvlText w:val="%1."/>
+      <w:lvlJc w:val="left"/>
+    </w:lvl>
+  </w:abstractNum>
+  <w:abstractNum w:abstractNumId="4" w15:restartNumberingAfterBreak="0">
+    <w:multiLevelType w:val="hybridMultilevel"/>
+    <w:lvl w:ilvl="0" w15:tentative="1">
+      <w:start w:val="1"/>
+      <w:numFmt w:val="lowerLetter"/>
+      <w:lvlText w:val="%1."/>
+      <w:lvlJc w:val="left"/>
+    </w:lvl>
+  </w:abstractNum>
+  <w:abstractNum w:abstractNumId="5" w15:restartNumberingAfterBreak="0">
+    <w:multiLevelType w:val="hybridMultilevel"/>
+    <w:lvl w:ilvl="0" w15:tentative="1">
       <w:start w:val="1"/>
       <w:numFmt w:val="decimal"/>
-      <w:lvlText w:val="%1"/>
-      <w:lvlJc w:val="start"/>
+      <w:lvlText w:val="%1)"/>
+      <w:lvlJc w:val="left"/>
+    </w:lvl>
+  </w:abstractNum>
+  <w:abstractNum w:abstractNumId="6" w15:restartNumberingAfterBreak="0">
+    <w:multiLevelType w:val="hybridMultilevel"/>
+    <w:lvl w:ilvl="0" w15:tentative="1">
+      <w:start w:val="1"/>
+      <w:numFmt w:val="lowerLetter"/>
+      <w:lvlText w:val="%1)"/>
+      <w:lvlJc w:val="left"/>
     </w:lvl>
   </w:abstractNum>
   <w:num w:numId="1">
@@ -235,20 +316,20 @@
       <w:startOverride w:val="1"/>
     </w:lvlOverride>
   </w:num>
-  <w:num w:numId="4">
+  <w:num w:numId="7">
     <w:abstractNumId w:val="2"/>
     <w:lvlOverride w:ilvl="0">
       <w:startOverride w:val="1"/>
     </w:lvlOverride>
   </w:num>
-  <w:num w:numId="5">
-    <w:abstractNumId w:val="2"/>
+  <w:num w:numId="8">
+    <w:abstractNumId w:val="4"/>
     <w:lvlOverride w:ilvl="0">
       <w:startOverride w:val="1"/>
     </w:lvlOverride>
   </w:num>
-  <w:num w:numId="6">
-    <w:abstractNumId w:val="2"/>
+  <w:num w:numId="9">
+    <w:abstractNumId w:val="4"/>
     <w:lvlOverride w:ilvl="0">
       <w:startOverride w:val="1"/>
     </w:lvlOverride>

</xml_diff>

<commit_message>
melengkapi isi dari tamplate file docx selesai
</commit_message>
<xml_diff>
--- a/formating-docx/My Document.docx
+++ b/formating-docx/My Document.docx
@@ -3,129 +3,110 @@
 <w:document xmlns:wpc="http://schemas.microsoft.com/office/word/2010/wordprocessingCanvas" xmlns:mc="http://schemas.openxmlformats.org/markup-compatibility/2006" xmlns:o="urn:schemas-microsoft-com:office:office" xmlns:r="http://schemas.openxmlformats.org/officeDocument/2006/relationships" xmlns:m="http://schemas.openxmlformats.org/officeDocument/2006/math" xmlns:v="urn:schemas-microsoft-com:vml" xmlns:wp14="http://schemas.microsoft.com/office/word/2010/wordprocessingDrawing" xmlns:wp="http://schemas.openxmlformats.org/drawingml/2006/wordprocessingDrawing" xmlns:w10="urn:schemas-microsoft-com:office:word" xmlns:w="http://schemas.openxmlformats.org/wordprocessingml/2006/main" xmlns:w14="http://schemas.microsoft.com/office/word/2010/wordml" xmlns:w15="http://schemas.microsoft.com/office/word/2012/wordml" xmlns:wpg="http://schemas.microsoft.com/office/word/2010/wordprocessingGroup" xmlns:wpi="http://schemas.microsoft.com/office/word/2010/wordprocessingInk" xmlns:wne="http://schemas.microsoft.com/office/word/2006/wordml" xmlns:wps="http://schemas.microsoft.com/office/word/2010/wordprocessingShape" xmlns:cx="http://schemas.microsoft.com/office/drawing/2014/chartex" xmlns:cx1="http://schemas.microsoft.com/office/drawing/2015/9/8/chartex" xmlns:cx2="http://schemas.microsoft.com/office/drawing/2015/10/21/chartex" xmlns:cx3="http://schemas.microsoft.com/office/drawing/2016/5/9/chartex" xmlns:cx4="http://schemas.microsoft.com/office/drawing/2016/5/10/chartex" xmlns:cx5="http://schemas.microsoft.com/office/drawing/2016/5/11/chartex" xmlns:cx6="http://schemas.microsoft.com/office/drawing/2016/5/12/chartex" xmlns:cx7="http://schemas.microsoft.com/office/drawing/2016/5/13/chartex" xmlns:cx8="http://schemas.microsoft.com/office/drawing/2016/5/14/chartex" xmlns:aink="http://schemas.microsoft.com/office/drawing/2016/ink" xmlns:am3d="http://schemas.microsoft.com/office/drawing/2017/model3d" xmlns:w16cex="http://schemas.microsoft.com/office/word/2018/wordml/cex" xmlns:w16cid="http://schemas.microsoft.com/office/word/2016/wordml/cid" xmlns:w16="http://schemas.microsoft.com/office/word/2018/wordml" xmlns:w16sdtdh="http://schemas.microsoft.com/office/word/2020/wordml/sdtdatahash" xmlns:w16se="http://schemas.microsoft.com/office/word/2015/wordml/symex" mc:Ignorable="w14 w15 wp14">
   <w:body>
     <w:p>
-      <w:pPr>
-        <w:pStyle w:val="bold"/>
-        <w:numPr>
-          <w:ilvl w:val="0"/>
-          <w:numId w:val="7"/>
-        </w:numPr>
-        <w:spacing w:line="360"/>
-        <w:ind w:left="283" w:hanging="272" w:firstLine="0"/>
-        <w:jc w:val="both"/>
-      </w:pPr>
-      <w:r>
-        <w:rPr>
-          <w:color w:val="000000"/>
-          <w:sz w:val="24"/>
-          <w:szCs w:val="24"/>
-          <w:rFonts w:ascii="Times New Roman" w:cs="Times New Roman" w:eastAsia="Times New Roman" w:hAnsi="Times New Roman"/>
-        </w:rPr>
-        <w:t xml:space="preserve">Pengertian Jihad</w:t>
-      </w:r>
-    </w:p>
-    <w:p>
-      <w:pPr>
-        <w:pStyle w:val="normal"/>
-        <w:numPr>
-          <w:ilvl w:val="0"/>
-          <w:numId w:val="8"/>
-        </w:numPr>
-        <w:spacing w:line="360"/>
-        <w:ind w:left="566" w:hanging="277" w:firstLine="277"/>
-        <w:jc w:val="both"/>
-      </w:pPr>
-      <w:r>
-        <w:rPr>
-          <w:color w:val="000000"/>
-          <w:sz w:val="24"/>
-          <w:szCs w:val="24"/>
-          <w:rFonts w:ascii="Times New Roman" w:cs="Times New Roman" w:eastAsia="Times New Roman" w:hAnsi="Times New Roman"/>
-        </w:rPr>
-        <w:t xml:space="preserve">Mengangkat senjata, sebagaimana dalam QS. An-Nisa: 95:</w:t>
-      </w:r>
-    </w:p>
-    <w:p>
-      <w:pPr>
-        <w:pStyle w:val="normal"/>
-        <w:numPr>
-          <w:ilvl w:val="0"/>
-          <w:numId w:val="8"/>
-        </w:numPr>
-        <w:spacing w:line="360"/>
-        <w:ind w:left="566" w:hanging="277" w:firstLine="277"/>
-        <w:jc w:val="both"/>
-      </w:pPr>
-      <w:r>
-        <w:rPr>
-          <w:color w:val="000000"/>
-          <w:sz w:val="24"/>
-          <w:szCs w:val="24"/>
-          <w:rFonts w:ascii="Times New Roman" w:cs="Times New Roman" w:eastAsia="Times New Roman" w:hAnsi="Times New Roman"/>
-        </w:rPr>
-        <w:t xml:space="preserve">Ucapan, argumen, dan pendapat (qawl), sebagaimana dalam QS. Al-Furqan: 52:</w:t>
-      </w:r>
-    </w:p>
-    <w:p>
-      <w:pPr>
-        <w:pStyle w:val="bold"/>
-        <w:numPr>
-          <w:ilvl w:val="0"/>
-          <w:numId w:val="7"/>
-        </w:numPr>
-        <w:spacing w:line="360"/>
-        <w:ind w:left="283" w:hanging="272" w:firstLine="0"/>
-        <w:jc w:val="both"/>
-      </w:pPr>
-      <w:r>
-        <w:rPr>
-          <w:color w:val="000000"/>
-          <w:sz w:val="24"/>
-          <w:szCs w:val="24"/>
-          <w:rFonts w:ascii="Times New Roman" w:cs="Times New Roman" w:eastAsia="Times New Roman" w:hAnsi="Times New Roman"/>
-        </w:rPr>
-        <w:t xml:space="preserve">Perbedaan Jihad dan Terorisme</w:t>
-      </w:r>
-    </w:p>
-    <w:p>
-      <w:pPr>
-        <w:pStyle w:val="normal"/>
-        <w:numPr>
-          <w:ilvl w:val="0"/>
-          <w:numId w:val="9"/>
-        </w:numPr>
-        <w:spacing w:line="360"/>
-        <w:ind w:left="566" w:hanging="277" w:firstLine="277"/>
-        <w:jc w:val="both"/>
-      </w:pPr>
-      <w:r>
-        <w:rPr>
-          <w:color w:val="000000"/>
-          <w:sz w:val="24"/>
-          <w:szCs w:val="24"/>
-          <w:rFonts w:ascii="Times New Roman" w:cs="Times New Roman" w:eastAsia="Times New Roman" w:hAnsi="Times New Roman"/>
-        </w:rPr>
-        <w:t xml:space="preserve">Mengangkat senjata, sebagaimana dalam QS. An-Nisa: 95:</w:t>
-      </w:r>
-    </w:p>
-    <w:p>
-      <w:pPr>
-        <w:pStyle w:val="normal"/>
-        <w:numPr>
-          <w:ilvl w:val="0"/>
-          <w:numId w:val="9"/>
-        </w:numPr>
-        <w:spacing w:line="360"/>
-        <w:ind w:left="566" w:hanging="277" w:firstLine="277"/>
-        <w:jc w:val="both"/>
-      </w:pPr>
-      <w:r>
-        <w:rPr>
-          <w:color w:val="000000"/>
-          <w:sz w:val="24"/>
-          <w:szCs w:val="24"/>
-          <w:rFonts w:ascii="Times New Roman" w:cs="Times New Roman" w:eastAsia="Times New Roman" w:hAnsi="Times New Roman"/>
-        </w:rPr>
-        <w:t xml:space="preserve">Ucapan, argumen, dan pendapat (qawl), sebagaimana dalam QS. Al-Furqan: 52:</w:t>
+      <w:r>
+        <w:t xml:space="preserve">Lorem ipsum dolor sit amet, consectetur adipiscing elit. Pellentesque imperdiet vehicula urna, in elementum erat vestibulum in. Phasellus faucibus arcu ac lacus vestibulum, nec tristique felis ultrices. Aliquam erat volutpat. Suspendisse potenti. Morbi commodo, nisi nec auctor ullamcorper, justo sapien pretium quam, a varius felis quam sed orci. Fusce dictum, justo vitae sodales cursus, neque magna vestibulum enim, et fermentum nisi purus et felis. Donec in nisl at libero consequat tincidunt. Sed fermentum lacinia libero, ac ultricies dolor mollis in. Nunc at ultricies orci. Integer sollicitudin velit ut sem auctor, et accumsan leo finibus. Mauris malesuada metus ac turpis ultricies, et tristique magna facilisis. Vivamus elementum purus ut eros consequat, sit amet vehicula odio scelerisque. Nullam in quam auctor, faucibus lorem id, iaculis velit.
+Sed ut perspiciatis unde omnis iste natus error sit voluptatem accusantium doloremque laudantium, totam rem aperiam, eaque ipsa quae ab illo inventore veritatis et quasi architecto beatae vitae dicta sunt explicabo. Nemo enim ipsam voluptatem quia voluptas sit aspernatur aut odit aut fugit, sed quia consequuntur magni dolores eos qui ratione voluptatem sequi nesciunt. Neque porro quisquam est, qui dolorem ipsum quia dolor sit amet, consectetur, adipisci velit, sed quia non numquam eius modi tempora incidunt ut labore et dolore magnam aliquam quaerat voluptatem. Ut enim ad minima veniam, quis nostrum exercitationem ullam corporis suscipit laboriosam, nisi ut aliquid ex ea commodi consequatur? Quis autem vel eum iure reprehenderit qui in ea voluptate velit esse quam nihil molestiae consequatur, vel illum qui dolorem eum fugiat quo voluptas nulla pariatur?</w:t>
+      </w:r>
+    </w:p>
+    <w:p>
+      <w:pPr>
+        <w:pStyle w:val="Heading1"/>
+      </w:pPr>
+      <w:r>
+        <w:t xml:space="preserve">Receipt 001</w:t>
+      </w:r>
+    </w:p>
+    <w:p>
+      <w:pPr>
+        <w:tabs>
+          <w:tab w:val="right" w:pos="9026" w:leader="dot"/>
+        </w:tabs>
+      </w:pPr>
+      <w:r>
+        <w:rPr>
+          <w:b/>
+          <w:bCs/>
+        </w:rPr>
+        <w:t xml:space="preserve">To Bob.	By Alice.</w:t>
+      </w:r>
+    </w:p>
+    <w:p>
+      <w:pPr>
+        <w:tabs>
+          <w:tab w:val="right" w:pos="9026"/>
+        </w:tabs>
+      </w:pPr>
+      <w:r>
+        <w:t xml:space="preserve">Foo Inc	Bar Inc</w:t>
+      </w:r>
+    </w:p>
+    <w:p/>
+    <w:p>
+      <w:pPr>
+        <w:tabs>
+          <w:tab w:val="right" w:pos="4513"/>
+          <w:tab w:val="right" w:pos="6769.5"/>
+          <w:tab w:val="right" w:pos="9026"/>
+        </w:tabs>
+      </w:pPr>
+      <w:r>
+        <w:rPr>
+          <w:b/>
+          <w:bCs/>
+        </w:rPr>
+        <w:t xml:space="preserve">Item	Price	Quantity	Sub-total</w:t>
+      </w:r>
+    </w:p>
+    <w:p>
+      <w:pPr>
+        <w:tabs>
+          <w:tab w:val="right" w:pos="4513"/>
+          <w:tab w:val="right" w:pos="6769.5"/>
+          <w:tab w:val="right" w:pos="9026"/>
+        </w:tabs>
+      </w:pPr>
+      <w:r>
+        <w:t xml:space="preserve">Item 3	10	5	50</w:t>
+      </w:r>
+    </w:p>
+    <w:p>
+      <w:pPr>
+        <w:tabs>
+          <w:tab w:val="right" w:pos="4513"/>
+          <w:tab w:val="right" w:pos="6769.5"/>
+          <w:tab w:val="right" w:pos="9026"/>
+        </w:tabs>
+      </w:pPr>
+      <w:r>
+        <w:t xml:space="preserve">Item 3	10	5	50</w:t>
+      </w:r>
+    </w:p>
+    <w:p>
+      <w:pPr>
+        <w:tabs>
+          <w:tab w:val="right" w:pos="4513"/>
+          <w:tab w:val="right" w:pos="6769.5"/>
+          <w:tab w:val="right" w:pos="9026"/>
+        </w:tabs>
+      </w:pPr>
+      <w:r>
+        <w:t xml:space="preserve">Item 3	10	5	50</w:t>
+      </w:r>
+    </w:p>
+    <w:p>
+      <w:pPr>
+        <w:tabs>
+          <w:tab w:val="right" w:pos="4513"/>
+          <w:tab w:val="right" w:pos="6769.5"/>
+          <w:tab w:val="right" w:pos="9026"/>
+        </w:tabs>
+      </w:pPr>
+      <w:r>
+        <w:rPr>
+          <w:b/>
+          <w:bCs/>
+        </w:rPr>
+        <w:t xml:space="preserve">			Total: 200</w:t>
       </w:r>
     </w:p>
     <w:sectPr>
@@ -265,71 +246,8 @@
       </w:pPr>
     </w:lvl>
   </w:abstractNum>
-  <w:abstractNum w:abstractNumId="2" w15:restartNumberingAfterBreak="0">
-    <w:multiLevelType w:val="hybridMultilevel"/>
-    <w:lvl w:ilvl="0" w15:tentative="1">
-      <w:start w:val="1"/>
-      <w:numFmt w:val="upperLetter"/>
-      <w:lvlText w:val="%1."/>
-      <w:lvlJc w:val="left"/>
-    </w:lvl>
-  </w:abstractNum>
-  <w:abstractNum w:abstractNumId="3" w15:restartNumberingAfterBreak="0">
-    <w:multiLevelType w:val="hybridMultilevel"/>
-    <w:lvl w:ilvl="0" w15:tentative="1">
-      <w:start w:val="1"/>
-      <w:numFmt w:val="decimal"/>
-      <w:lvlText w:val="%1."/>
-      <w:lvlJc w:val="left"/>
-    </w:lvl>
-  </w:abstractNum>
-  <w:abstractNum w:abstractNumId="4" w15:restartNumberingAfterBreak="0">
-    <w:multiLevelType w:val="hybridMultilevel"/>
-    <w:lvl w:ilvl="0" w15:tentative="1">
-      <w:start w:val="1"/>
-      <w:numFmt w:val="lowerLetter"/>
-      <w:lvlText w:val="%1."/>
-      <w:lvlJc w:val="left"/>
-    </w:lvl>
-  </w:abstractNum>
-  <w:abstractNum w:abstractNumId="5" w15:restartNumberingAfterBreak="0">
-    <w:multiLevelType w:val="hybridMultilevel"/>
-    <w:lvl w:ilvl="0" w15:tentative="1">
-      <w:start w:val="1"/>
-      <w:numFmt w:val="decimal"/>
-      <w:lvlText w:val="%1)"/>
-      <w:lvlJc w:val="left"/>
-    </w:lvl>
-  </w:abstractNum>
-  <w:abstractNum w:abstractNumId="6" w15:restartNumberingAfterBreak="0">
-    <w:multiLevelType w:val="hybridMultilevel"/>
-    <w:lvl w:ilvl="0" w15:tentative="1">
-      <w:start w:val="1"/>
-      <w:numFmt w:val="lowerLetter"/>
-      <w:lvlText w:val="%1)"/>
-      <w:lvlJc w:val="left"/>
-    </w:lvl>
-  </w:abstractNum>
   <w:num w:numId="1">
     <w:abstractNumId w:val="1"/>
-    <w:lvlOverride w:ilvl="0">
-      <w:startOverride w:val="1"/>
-    </w:lvlOverride>
-  </w:num>
-  <w:num w:numId="7">
-    <w:abstractNumId w:val="2"/>
-    <w:lvlOverride w:ilvl="0">
-      <w:startOverride w:val="1"/>
-    </w:lvlOverride>
-  </w:num>
-  <w:num w:numId="8">
-    <w:abstractNumId w:val="4"/>
-    <w:lvlOverride w:ilvl="0">
-      <w:startOverride w:val="1"/>
-    </w:lvlOverride>
-  </w:num>
-  <w:num w:numId="9">
-    <w:abstractNumId w:val="4"/>
     <w:lvlOverride w:ilvl="0">
       <w:startOverride w:val="1"/>
     </w:lvlOverride>

</xml_diff>